<commit_message>
feat: added Task to docx
</commit_message>
<xml_diff>
--- a/Erlebnistag1 2025.docx
+++ b/Erlebnistag1 2025.docx
@@ -3082,7 +3082,36 @@
     </w:p>
     <w:p>
       <w:r>
-        <w:t>Ziel: Bei dieser aufgabe erstellst du einen Mechanismus der es ermöglicht auf knopf druck die zeit zu anhalten</w:t>
+        <w:rPr>
+          <w:sz w:val="22"/>
+        </w:rPr>
+        <w:t xml:space="preserve">Ziel: Wenn du die Taste </w:t>
+      </w:r>
+      <w:r>
+        <w:rPr>
+          <w:b/>
+          <w:sz w:val="22"/>
+        </w:rPr>
+        <w:t>T</w:t>
+      </w:r>
+      <w:r>
+        <w:rPr>
+          <w:sz w:val="22"/>
+        </w:rPr>
+        <w:t xml:space="preserve"> drückst, werden alle Gegner, ihre Schüsse und Power-Ups für </w:t>
+      </w:r>
+      <w:r>
+        <w:rPr>
+          <w:b/>
+          <w:sz w:val="22"/>
+        </w:rPr>
+        <w:t>3 Sekunden</w:t>
+      </w:r>
+      <w:r>
+        <w:rPr>
+          <w:sz w:val="22"/>
+        </w:rPr>
+        <w:t xml:space="preserve"> eingefroren – du kannst dich aber weiterhin bewegen und schiessen!</w:t>
       </w:r>
     </w:p>
     <w:p/>
@@ -3127,6 +3156,346 @@
           <w:szCs w:val="24"/>
         </w:rPr>
         <w:commentReference w:id="8"/>
+      </w:r>
+    </w:p>
+    <w:p>
+      <w:pPr/>
+    </w:p>
+    <w:p>
+      <w:pPr/>
+      <w:r>
+        <w:rPr>
+          <w:b/>
+          <w:sz w:val="22"/>
+        </w:rPr>
+        <w:t>Schritt 1: Neue Variablen hinzufügen</w:t>
+      </w:r>
+    </w:p>
+    <w:p>
+      <w:pPr/>
+    </w:p>
+    <w:p>
+      <w:pPr/>
+      <w:r>
+        <w:rPr>
+          <w:b w:val="0"/>
+          <w:sz w:val="22"/>
+        </w:rPr>
+        <w:t>Ganz oben in deinem main.py, direkt nach den Turbo-Variablen (ULT_ACTIVE / ULT_START), schreibe diese drei Zeilen:</w:t>
+      </w:r>
+    </w:p>
+    <w:p>
+      <w:pPr/>
+    </w:p>
+    <w:p>
+      <w:pPr/>
+      <w:r>
+        <w:drawing>
+          <wp:inline xmlns:a="http://schemas.openxmlformats.org/drawingml/2006/main" xmlns:pic="http://schemas.openxmlformats.org/drawingml/2006/picture">
+            <wp:extent cx="4114800" cy="1123545"/>
+            <wp:docPr id="2048877115" name="Picture 2048877115"/>
+            <wp:cNvGraphicFramePr>
+              <a:graphicFrameLocks noChangeAspect="1"/>
+            </wp:cNvGraphicFramePr>
+            <a:graphic>
+              <a:graphicData uri="http://schemas.openxmlformats.org/drawingml/2006/picture">
+                <pic:pic>
+                  <pic:nvPicPr>
+                    <pic:cNvPr id="0" name="ts1_vars.png"/>
+                    <pic:cNvPicPr/>
+                  </pic:nvPicPr>
+                  <pic:blipFill>
+                    <a:blip r:embed="rId38"/>
+                    <a:stretch>
+                      <a:fillRect/>
+                    </a:stretch>
+                  </pic:blipFill>
+                  <pic:spPr>
+                    <a:xfrm>
+                      <a:off x="0" y="0"/>
+                      <a:ext cx="4114800" cy="1123545"/>
+                    </a:xfrm>
+                    <a:prstGeom prst="rect"/>
+                  </pic:spPr>
+                </pic:pic>
+              </a:graphicData>
+            </a:graphic>
+          </wp:inline>
+        </w:drawing>
+      </w:r>
+    </w:p>
+    <w:p>
+      <w:pPr/>
+    </w:p>
+    <w:p>
+      <w:pPr/>
+      <w:r>
+        <w:rPr>
+          <w:b/>
+          <w:sz w:val="22"/>
+        </w:rPr>
+        <w:t>Schritt 2: Timer-Check hinzufügen</w:t>
+      </w:r>
+    </w:p>
+    <w:p>
+      <w:pPr/>
+    </w:p>
+    <w:p>
+      <w:pPr/>
+      <w:r>
+        <w:rPr>
+          <w:b w:val="0"/>
+          <w:sz w:val="22"/>
+        </w:rPr>
+        <w:t>Suche in der handle_input() Funktion diesen Kommentar:</w:t>
+      </w:r>
+    </w:p>
+    <w:p>
+      <w:pPr/>
+    </w:p>
+    <w:p>
+      <w:pPr/>
+      <w:r>
+        <w:drawing>
+          <wp:inline xmlns:a="http://schemas.openxmlformats.org/drawingml/2006/main" xmlns:pic="http://schemas.openxmlformats.org/drawingml/2006/picture">
+            <wp:extent cx="5029200" cy="452821"/>
+            <wp:docPr id="2048877116" name="Picture 2048877116"/>
+            <wp:cNvGraphicFramePr>
+              <a:graphicFrameLocks noChangeAspect="1"/>
+            </wp:cNvGraphicFramePr>
+            <a:graphic>
+              <a:graphicData uri="http://schemas.openxmlformats.org/drawingml/2006/picture">
+                <pic:pic>
+                  <pic:nvPicPr>
+                    <pic:cNvPr id="0" name="ts2_search.png"/>
+                    <pic:cNvPicPr/>
+                  </pic:nvPicPr>
+                  <pic:blipFill>
+                    <a:blip r:embed="rId39"/>
+                    <a:stretch>
+                      <a:fillRect/>
+                    </a:stretch>
+                  </pic:blipFill>
+                  <pic:spPr>
+                    <a:xfrm>
+                      <a:off x="0" y="0"/>
+                      <a:ext cx="5029200" cy="452821"/>
+                    </a:xfrm>
+                    <a:prstGeom prst="rect"/>
+                  </pic:spPr>
+                </pic:pic>
+              </a:graphicData>
+            </a:graphic>
+          </wp:inline>
+        </w:drawing>
+      </w:r>
+    </w:p>
+    <w:p>
+      <w:pPr/>
+    </w:p>
+    <w:p>
+      <w:pPr/>
+      <w:r>
+        <w:rPr>
+          <w:b w:val="0"/>
+          <w:sz w:val="22"/>
+        </w:rPr>
+        <w:t>Schreibe direkt darunter folgenden Code – dieser schaltet den Zeit-Stopp automatisch nach 3 Sekunden wieder aus:</w:t>
+      </w:r>
+    </w:p>
+    <w:p>
+      <w:pPr/>
+    </w:p>
+    <w:p>
+      <w:pPr/>
+      <w:r>
+        <w:drawing>
+          <wp:inline xmlns:a="http://schemas.openxmlformats.org/drawingml/2006/main" xmlns:pic="http://schemas.openxmlformats.org/drawingml/2006/picture">
+            <wp:extent cx="5486400" cy="468351"/>
+            <wp:docPr id="2048877117" name="Picture 2048877117"/>
+            <wp:cNvGraphicFramePr>
+              <a:graphicFrameLocks noChangeAspect="1"/>
+            </wp:cNvGraphicFramePr>
+            <a:graphic>
+              <a:graphicData uri="http://schemas.openxmlformats.org/drawingml/2006/picture">
+                <pic:pic>
+                  <pic:nvPicPr>
+                    <pic:cNvPr id="0" name="ts3_timer.png"/>
+                    <pic:cNvPicPr/>
+                  </pic:nvPicPr>
+                  <pic:blipFill>
+                    <a:blip r:embed="rId40"/>
+                    <a:stretch>
+                      <a:fillRect/>
+                    </a:stretch>
+                  </pic:blipFill>
+                  <pic:spPr>
+                    <a:xfrm>
+                      <a:off x="0" y="0"/>
+                      <a:ext cx="5486400" cy="468351"/>
+                    </a:xfrm>
+                    <a:prstGeom prst="rect"/>
+                  </pic:spPr>
+                </pic:pic>
+              </a:graphicData>
+            </a:graphic>
+          </wp:inline>
+        </w:drawing>
+      </w:r>
+    </w:p>
+    <w:p>
+      <w:pPr/>
+    </w:p>
+    <w:p>
+      <w:pPr/>
+      <w:r>
+        <w:rPr>
+          <w:b/>
+          <w:sz w:val="22"/>
+        </w:rPr>
+        <w:t>Schritt 3: T-Taste aktivieren</w:t>
+      </w:r>
+    </w:p>
+    <w:p>
+      <w:pPr/>
+    </w:p>
+    <w:p>
+      <w:pPr/>
+      <w:r>
+        <w:rPr>
+          <w:b w:val="0"/>
+          <w:sz w:val="22"/>
+        </w:rPr>
+        <w:t>Suche weiter unten in handle_input() diesen Kommentar:</w:t>
+      </w:r>
+    </w:p>
+    <w:p>
+      <w:pPr/>
+    </w:p>
+    <w:p>
+      <w:pPr/>
+      <w:r>
+        <w:drawing>
+          <wp:inline xmlns:a="http://schemas.openxmlformats.org/drawingml/2006/main" xmlns:pic="http://schemas.openxmlformats.org/drawingml/2006/picture">
+            <wp:extent cx="4114800" cy="481084"/>
+            <wp:docPr id="2048877118" name="Picture 2048877118"/>
+            <wp:cNvGraphicFramePr>
+              <a:graphicFrameLocks noChangeAspect="1"/>
+            </wp:cNvGraphicFramePr>
+            <a:graphic>
+              <a:graphicData uri="http://schemas.openxmlformats.org/drawingml/2006/picture">
+                <pic:pic>
+                  <pic:nvPicPr>
+                    <pic:cNvPr id="0" name="ts4_search.png"/>
+                    <pic:cNvPicPr/>
+                  </pic:nvPicPr>
+                  <pic:blipFill>
+                    <a:blip r:embed="rId41"/>
+                    <a:stretch>
+                      <a:fillRect/>
+                    </a:stretch>
+                  </pic:blipFill>
+                  <pic:spPr>
+                    <a:xfrm>
+                      <a:off x="0" y="0"/>
+                      <a:ext cx="4114800" cy="481084"/>
+                    </a:xfrm>
+                    <a:prstGeom prst="rect"/>
+                  </pic:spPr>
+                </pic:pic>
+              </a:graphicData>
+            </a:graphic>
+          </wp:inline>
+        </w:drawing>
+      </w:r>
+    </w:p>
+    <w:p>
+      <w:pPr/>
+    </w:p>
+    <w:p>
+      <w:pPr/>
+      <w:r>
+        <w:rPr>
+          <w:b w:val="0"/>
+          <w:sz w:val="22"/>
+        </w:rPr>
+        <w:t>Schreibe direkt darunter diesen Code – er startet den Zeit-Stopp wenn du T drückst:</w:t>
+      </w:r>
+    </w:p>
+    <w:p>
+      <w:pPr/>
+    </w:p>
+    <w:p>
+      <w:pPr/>
+      <w:r>
+        <w:drawing>
+          <wp:inline xmlns:a="http://schemas.openxmlformats.org/drawingml/2006/main" xmlns:pic="http://schemas.openxmlformats.org/drawingml/2006/picture">
+            <wp:extent cx="5669280" cy="1252993"/>
+            <wp:docPr id="2048877119" name="Picture 2048877119"/>
+            <wp:cNvGraphicFramePr>
+              <a:graphicFrameLocks noChangeAspect="1"/>
+            </wp:cNvGraphicFramePr>
+            <a:graphic>
+              <a:graphicData uri="http://schemas.openxmlformats.org/drawingml/2006/picture">
+                <pic:pic>
+                  <pic:nvPicPr>
+                    <pic:cNvPr id="0" name="ts5_activate.png"/>
+                    <pic:cNvPicPr/>
+                  </pic:nvPicPr>
+                  <pic:blipFill>
+                    <a:blip r:embed="rId42"/>
+                    <a:stretch>
+                      <a:fillRect/>
+                    </a:stretch>
+                  </pic:blipFill>
+                  <pic:spPr>
+                    <a:xfrm>
+                      <a:off x="0" y="0"/>
+                      <a:ext cx="5669280" cy="1252993"/>
+                    </a:xfrm>
+                    <a:prstGeom prst="rect"/>
+                  </pic:spPr>
+                </pic:pic>
+              </a:graphicData>
+            </a:graphic>
+          </wp:inline>
+        </w:drawing>
+      </w:r>
+    </w:p>
+    <w:p>
+      <w:pPr/>
+    </w:p>
+    <w:p>
+      <w:pPr/>
+      <w:r>
+        <w:rPr>
+          <w:b/>
+          <w:sz w:val="22"/>
+        </w:rPr>
+        <w:t>Testen:</w:t>
+      </w:r>
+    </w:p>
+    <w:p>
+      <w:pPr/>
+      <w:r>
+        <w:rPr>
+          <w:b w:val="0"/>
+          <w:sz w:val="22"/>
+        </w:rPr>
+        <w:t>Starte das Spiel und drücke T. Hören die Gegner auf, sich zu bewegen? Kannst du dich selbst noch bewegen?</w:t>
+      </w:r>
+    </w:p>
+    <w:p>
+      <w:pPr/>
+    </w:p>
+    <w:p>
+      <w:pPr/>
+      <w:r>
+        <w:rPr>
+          <w:b w:val="0"/>
+          <w:sz w:val="22"/>
+        </w:rPr>
+        <w:t>Tipp: Du kannst die Dauer anpassen, indem du den Wert 3000 in TIME_STOP_DURATION änderst (z. B. 5000 = 5 Sekunden).</w:t>
       </w:r>
     </w:p>
     <w:sectPr>

</xml_diff>

<commit_message>
feat: add installer script for Mini-Schnuppertag project
</commit_message>
<xml_diff>
--- a/Erlebnistag1 2025.docx
+++ b/Erlebnistag1 2025.docx
@@ -3082,35 +3082,24 @@
     </w:p>
     <w:p>
       <w:r>
-        <w:rPr>
-          <w:sz w:val="22"/>
-        </w:rPr>
         <w:t xml:space="preserve">Ziel: Wenn du die Taste </w:t>
       </w:r>
       <w:r>
         <w:rPr>
           <w:b/>
-          <w:sz w:val="22"/>
         </w:rPr>
         <w:t>T</w:t>
       </w:r>
       <w:r>
-        <w:rPr>
-          <w:sz w:val="22"/>
-        </w:rPr>
         <w:t xml:space="preserve"> drückst, werden alle Gegner, ihre Schüsse und Power-Ups für </w:t>
       </w:r>
       <w:r>
         <w:rPr>
           <w:b/>
-          <w:sz w:val="22"/>
         </w:rPr>
         <w:t>3 Sekunden</w:t>
       </w:r>
       <w:r>
-        <w:rPr>
-          <w:sz w:val="22"/>
-        </w:rPr>
         <w:t xml:space="preserve"> eingefroren – du kannst dich aber weiterhin bewegen und schiessen!</w:t>
       </w:r>
     </w:p>
@@ -3158,50 +3147,202 @@
         <w:commentReference w:id="8"/>
       </w:r>
     </w:p>
-    <w:p>
-      <w:pPr/>
-    </w:p>
-    <w:p>
-      <w:pPr/>
+    <w:p/>
+    <w:p>
       <w:r>
         <w:rPr>
           <w:b/>
-          <w:sz w:val="22"/>
         </w:rPr>
         <w:t>Schritt 1: Neue Variablen hinzufügen</w:t>
       </w:r>
     </w:p>
-    <w:p>
-      <w:pPr/>
-    </w:p>
-    <w:p>
-      <w:pPr/>
-      <w:r>
-        <w:rPr>
-          <w:b w:val="0"/>
-          <w:sz w:val="22"/>
-        </w:rPr>
+    <w:p/>
+    <w:p>
+      <w:r>
         <w:t>Ganz oben in deinem main.py, direkt nach den Turbo-Variablen (ULT_ACTIVE / ULT_START), schreibe diese drei Zeilen:</w:t>
       </w:r>
     </w:p>
-    <w:p>
-      <w:pPr/>
-    </w:p>
-    <w:p>
-      <w:pPr/>
-      <w:r>
+    <w:p/>
+    <w:p>
+      <w:r>
+        <w:rPr>
+          <w:noProof/>
+        </w:rPr>
         <w:drawing>
-          <wp:inline xmlns:a="http://schemas.openxmlformats.org/drawingml/2006/main" xmlns:pic="http://schemas.openxmlformats.org/drawingml/2006/picture">
-            <wp:extent cx="4114800" cy="1123545"/>
+          <wp:inline distT="0" distB="0" distL="0" distR="0" wp14:anchorId="4C6E8061" wp14:editId="52FBD0FA">
+            <wp:extent cx="3034145" cy="828472"/>
+            <wp:effectExtent l="0" t="0" r="0" b="0"/>
             <wp:docPr id="2048877115" name="Picture 2048877115"/>
             <wp:cNvGraphicFramePr>
-              <a:graphicFrameLocks noChangeAspect="1"/>
+              <a:graphicFrameLocks xmlns:a="http://schemas.openxmlformats.org/drawingml/2006/main" noChangeAspect="1"/>
             </wp:cNvGraphicFramePr>
-            <a:graphic>
+            <a:graphic xmlns:a="http://schemas.openxmlformats.org/drawingml/2006/main">
               <a:graphicData uri="http://schemas.openxmlformats.org/drawingml/2006/picture">
-                <pic:pic>
+                <pic:pic xmlns:pic="http://schemas.openxmlformats.org/drawingml/2006/picture">
                   <pic:nvPicPr>
                     <pic:cNvPr id="0" name="ts1_vars.png"/>
+                    <pic:cNvPicPr/>
+                  </pic:nvPicPr>
+                  <pic:blipFill>
+                    <a:blip r:embed="rId35"/>
+                    <a:stretch>
+                      <a:fillRect/>
+                    </a:stretch>
+                  </pic:blipFill>
+                  <pic:spPr>
+                    <a:xfrm>
+                      <a:off x="0" y="0"/>
+                      <a:ext cx="3070359" cy="838360"/>
+                    </a:xfrm>
+                    <a:prstGeom prst="rect">
+                      <a:avLst/>
+                    </a:prstGeom>
+                  </pic:spPr>
+                </pic:pic>
+              </a:graphicData>
+            </a:graphic>
+          </wp:inline>
+        </w:drawing>
+      </w:r>
+    </w:p>
+    <w:p/>
+    <w:p>
+      <w:r>
+        <w:rPr>
+          <w:b/>
+        </w:rPr>
+        <w:t>Schritt 2: Timer-Check hinzufügen</w:t>
+      </w:r>
+    </w:p>
+    <w:p/>
+    <w:p>
+      <w:r>
+        <w:t>Suche in der handle_input() Funktion diesen Kommentar:</w:t>
+      </w:r>
+    </w:p>
+    <w:p/>
+    <w:p>
+      <w:r>
+        <w:rPr>
+          <w:noProof/>
+        </w:rPr>
+        <w:drawing>
+          <wp:inline distT="0" distB="0" distL="0" distR="0" wp14:anchorId="463FDEF5" wp14:editId="1B592F0E">
+            <wp:extent cx="5029200" cy="452821"/>
+            <wp:effectExtent l="0" t="0" r="0" b="0"/>
+            <wp:docPr id="2048877116" name="Picture 2048877116"/>
+            <wp:cNvGraphicFramePr>
+              <a:graphicFrameLocks xmlns:a="http://schemas.openxmlformats.org/drawingml/2006/main" noChangeAspect="1"/>
+            </wp:cNvGraphicFramePr>
+            <a:graphic xmlns:a="http://schemas.openxmlformats.org/drawingml/2006/main">
+              <a:graphicData uri="http://schemas.openxmlformats.org/drawingml/2006/picture">
+                <pic:pic xmlns:pic="http://schemas.openxmlformats.org/drawingml/2006/picture">
+                  <pic:nvPicPr>
+                    <pic:cNvPr id="0" name="ts2_search.png"/>
+                    <pic:cNvPicPr/>
+                  </pic:nvPicPr>
+                  <pic:blipFill>
+                    <a:blip r:embed="rId36"/>
+                    <a:stretch>
+                      <a:fillRect/>
+                    </a:stretch>
+                  </pic:blipFill>
+                  <pic:spPr>
+                    <a:xfrm>
+                      <a:off x="0" y="0"/>
+                      <a:ext cx="5029200" cy="452821"/>
+                    </a:xfrm>
+                    <a:prstGeom prst="rect">
+                      <a:avLst/>
+                    </a:prstGeom>
+                  </pic:spPr>
+                </pic:pic>
+              </a:graphicData>
+            </a:graphic>
+          </wp:inline>
+        </w:drawing>
+      </w:r>
+    </w:p>
+    <w:p/>
+    <w:p>
+      <w:r>
+        <w:t>Schreibe direkt darunter folgenden Code – dieser schaltet den Zeit-Stopp automatisch nach 3 Sekunden wieder aus:</w:t>
+      </w:r>
+    </w:p>
+    <w:p/>
+    <w:p>
+      <w:r>
+        <w:drawing>
+          <wp:inline distT="0" distB="0" distL="0" distR="0" wp14:anchorId="0A2AEC1C" wp14:editId="26FBF1CE">
+            <wp:extent cx="5731510" cy="528320"/>
+            <wp:effectExtent l="0" t="0" r="2540" b="5080"/>
+            <wp:docPr id="2076873230" name="Grafik 1"/>
+            <wp:cNvGraphicFramePr>
+              <a:graphicFrameLocks xmlns:a="http://schemas.openxmlformats.org/drawingml/2006/main" noChangeAspect="1"/>
+            </wp:cNvGraphicFramePr>
+            <a:graphic xmlns:a="http://schemas.openxmlformats.org/drawingml/2006/main">
+              <a:graphicData uri="http://schemas.openxmlformats.org/drawingml/2006/picture">
+                <pic:pic xmlns:pic="http://schemas.openxmlformats.org/drawingml/2006/picture">
+                  <pic:nvPicPr>
+                    <pic:cNvPr id="2076873230" name=""/>
+                    <pic:cNvPicPr/>
+                  </pic:nvPicPr>
+                  <pic:blipFill>
+                    <a:blip r:embed="rId37"/>
+                    <a:stretch>
+                      <a:fillRect/>
+                    </a:stretch>
+                  </pic:blipFill>
+                  <pic:spPr>
+                    <a:xfrm>
+                      <a:off x="0" y="0"/>
+                      <a:ext cx="5731510" cy="528320"/>
+                    </a:xfrm>
+                    <a:prstGeom prst="rect">
+                      <a:avLst/>
+                    </a:prstGeom>
+                  </pic:spPr>
+                </pic:pic>
+              </a:graphicData>
+            </a:graphic>
+          </wp:inline>
+        </w:drawing>
+      </w:r>
+    </w:p>
+    <w:p/>
+    <w:p>
+      <w:r>
+        <w:rPr>
+          <w:b/>
+        </w:rPr>
+        <w:t>Schritt 3: T-Taste aktivieren</w:t>
+      </w:r>
+    </w:p>
+    <w:p/>
+    <w:p>
+      <w:r>
+        <w:t>Suche weiter unten in handle_input() diesen Kommentar:</w:t>
+      </w:r>
+    </w:p>
+    <w:p/>
+    <w:p>
+      <w:r>
+        <w:rPr>
+          <w:noProof/>
+        </w:rPr>
+        <w:drawing>
+          <wp:inline distT="0" distB="0" distL="0" distR="0" wp14:anchorId="476EDB97" wp14:editId="0E4A854B">
+            <wp:extent cx="2916382" cy="340970"/>
+            <wp:effectExtent l="0" t="0" r="0" b="2540"/>
+            <wp:docPr id="2048877118" name="Picture 2048877118"/>
+            <wp:cNvGraphicFramePr>
+              <a:graphicFrameLocks xmlns:a="http://schemas.openxmlformats.org/drawingml/2006/main" noChangeAspect="1"/>
+            </wp:cNvGraphicFramePr>
+            <a:graphic xmlns:a="http://schemas.openxmlformats.org/drawingml/2006/main">
+              <a:graphicData uri="http://schemas.openxmlformats.org/drawingml/2006/picture">
+                <pic:pic xmlns:pic="http://schemas.openxmlformats.org/drawingml/2006/picture">
+                  <pic:nvPicPr>
+                    <pic:cNvPr id="0" name="ts4_search.png"/>
                     <pic:cNvPicPr/>
                   </pic:nvPicPr>
                   <pic:blipFill>
@@ -3213,9 +3354,11 @@
                   <pic:spPr>
                     <a:xfrm>
                       <a:off x="0" y="0"/>
-                      <a:ext cx="4114800" cy="1123545"/>
+                      <a:ext cx="2962841" cy="346402"/>
                     </a:xfrm>
-                    <a:prstGeom prst="rect"/>
+                    <a:prstGeom prst="rect">
+                      <a:avLst/>
+                    </a:prstGeom>
                   </pic:spPr>
                 </pic:pic>
               </a:graphicData>
@@ -3224,50 +3367,28 @@
         </w:drawing>
       </w:r>
     </w:p>
-    <w:p>
-      <w:pPr/>
-    </w:p>
-    <w:p>
-      <w:pPr/>
-      <w:r>
-        <w:rPr>
-          <w:b/>
-          <w:sz w:val="22"/>
-        </w:rPr>
-        <w:t>Schritt 2: Timer-Check hinzufügen</w:t>
-      </w:r>
-    </w:p>
-    <w:p>
-      <w:pPr/>
-    </w:p>
-    <w:p>
-      <w:pPr/>
-      <w:r>
-        <w:rPr>
-          <w:b w:val="0"/>
-          <w:sz w:val="22"/>
-        </w:rPr>
-        <w:t>Suche in der handle_input() Funktion diesen Kommentar:</w:t>
-      </w:r>
-    </w:p>
-    <w:p>
-      <w:pPr/>
-    </w:p>
-    <w:p>
-      <w:pPr/>
+    <w:p/>
+    <w:p>
+      <w:r>
+        <w:t>Schreibe direkt darunter diesen Code – er startet den Zeit-Stopp wenn du T drückst:</w:t>
+      </w:r>
+    </w:p>
+    <w:p/>
+    <w:p>
       <w:r>
         <w:drawing>
-          <wp:inline xmlns:a="http://schemas.openxmlformats.org/drawingml/2006/main" xmlns:pic="http://schemas.openxmlformats.org/drawingml/2006/picture">
-            <wp:extent cx="5029200" cy="452821"/>
-            <wp:docPr id="2048877116" name="Picture 2048877116"/>
+          <wp:inline distT="0" distB="0" distL="0" distR="0" wp14:anchorId="10F00CEE" wp14:editId="108973B5">
+            <wp:extent cx="4184073" cy="1004777"/>
+            <wp:effectExtent l="0" t="0" r="6985" b="5080"/>
+            <wp:docPr id="1375691405" name="Grafik 1"/>
             <wp:cNvGraphicFramePr>
-              <a:graphicFrameLocks noChangeAspect="1"/>
+              <a:graphicFrameLocks xmlns:a="http://schemas.openxmlformats.org/drawingml/2006/main" noChangeAspect="1"/>
             </wp:cNvGraphicFramePr>
-            <a:graphic>
+            <a:graphic xmlns:a="http://schemas.openxmlformats.org/drawingml/2006/main">
               <a:graphicData uri="http://schemas.openxmlformats.org/drawingml/2006/picture">
-                <pic:pic>
+                <pic:pic xmlns:pic="http://schemas.openxmlformats.org/drawingml/2006/picture">
                   <pic:nvPicPr>
-                    <pic:cNvPr id="0" name="ts2_search.png"/>
+                    <pic:cNvPr id="1375691405" name=""/>
                     <pic:cNvPicPr/>
                   </pic:nvPicPr>
                   <pic:blipFill>
@@ -3279,9 +3400,11 @@
                   <pic:spPr>
                     <a:xfrm>
                       <a:off x="0" y="0"/>
-                      <a:ext cx="5029200" cy="452821"/>
+                      <a:ext cx="4200621" cy="1008751"/>
                     </a:xfrm>
-                    <a:prstGeom prst="rect"/>
+                    <a:prstGeom prst="rect">
+                      <a:avLst/>
+                    </a:prstGeom>
                   </pic:spPr>
                 </pic:pic>
               </a:graphicData>
@@ -3290,211 +3413,38 @@
         </w:drawing>
       </w:r>
     </w:p>
-    <w:p>
-      <w:pPr/>
-    </w:p>
-    <w:p>
-      <w:pPr/>
-      <w:r>
-        <w:rPr>
-          <w:b w:val="0"/>
-          <w:sz w:val="22"/>
-        </w:rPr>
-        <w:t>Schreibe direkt darunter folgenden Code – dieser schaltet den Zeit-Stopp automatisch nach 3 Sekunden wieder aus:</w:t>
-      </w:r>
-    </w:p>
-    <w:p>
-      <w:pPr/>
-    </w:p>
-    <w:p>
-      <w:pPr/>
-      <w:r>
-        <w:drawing>
-          <wp:inline xmlns:a="http://schemas.openxmlformats.org/drawingml/2006/main" xmlns:pic="http://schemas.openxmlformats.org/drawingml/2006/picture">
-            <wp:extent cx="5486400" cy="468351"/>
-            <wp:docPr id="2048877117" name="Picture 2048877117"/>
-            <wp:cNvGraphicFramePr>
-              <a:graphicFrameLocks noChangeAspect="1"/>
-            </wp:cNvGraphicFramePr>
-            <a:graphic>
-              <a:graphicData uri="http://schemas.openxmlformats.org/drawingml/2006/picture">
-                <pic:pic>
-                  <pic:nvPicPr>
-                    <pic:cNvPr id="0" name="ts3_timer.png"/>
-                    <pic:cNvPicPr/>
-                  </pic:nvPicPr>
-                  <pic:blipFill>
-                    <a:blip r:embed="rId40"/>
-                    <a:stretch>
-                      <a:fillRect/>
-                    </a:stretch>
-                  </pic:blipFill>
-                  <pic:spPr>
-                    <a:xfrm>
-                      <a:off x="0" y="0"/>
-                      <a:ext cx="5486400" cy="468351"/>
-                    </a:xfrm>
-                    <a:prstGeom prst="rect"/>
-                  </pic:spPr>
-                </pic:pic>
-              </a:graphicData>
-            </a:graphic>
-          </wp:inline>
-        </w:drawing>
-      </w:r>
-    </w:p>
-    <w:p>
-      <w:pPr/>
-    </w:p>
-    <w:p>
-      <w:pPr/>
-      <w:r>
+    <w:p/>
+    <w:p>
+      <w:pPr>
         <w:rPr>
           <w:b/>
-          <w:sz w:val="22"/>
-        </w:rPr>
-        <w:t>Schritt 3: T-Taste aktivieren</w:t>
-      </w:r>
-    </w:p>
-    <w:p>
-      <w:pPr/>
-    </w:p>
-    <w:p>
-      <w:pPr/>
-      <w:r>
-        <w:rPr>
-          <w:b w:val="0"/>
-          <w:sz w:val="22"/>
-        </w:rPr>
-        <w:t>Suche weiter unten in handle_input() diesen Kommentar:</w:t>
-      </w:r>
-    </w:p>
-    <w:p>
-      <w:pPr/>
-    </w:p>
-    <w:p>
-      <w:pPr/>
-      <w:r>
-        <w:drawing>
-          <wp:inline xmlns:a="http://schemas.openxmlformats.org/drawingml/2006/main" xmlns:pic="http://schemas.openxmlformats.org/drawingml/2006/picture">
-            <wp:extent cx="4114800" cy="481084"/>
-            <wp:docPr id="2048877118" name="Picture 2048877118"/>
-            <wp:cNvGraphicFramePr>
-              <a:graphicFrameLocks noChangeAspect="1"/>
-            </wp:cNvGraphicFramePr>
-            <a:graphic>
-              <a:graphicData uri="http://schemas.openxmlformats.org/drawingml/2006/picture">
-                <pic:pic>
-                  <pic:nvPicPr>
-                    <pic:cNvPr id="0" name="ts4_search.png"/>
-                    <pic:cNvPicPr/>
-                  </pic:nvPicPr>
-                  <pic:blipFill>
-                    <a:blip r:embed="rId41"/>
-                    <a:stretch>
-                      <a:fillRect/>
-                    </a:stretch>
-                  </pic:blipFill>
-                  <pic:spPr>
-                    <a:xfrm>
-                      <a:off x="0" y="0"/>
-                      <a:ext cx="4114800" cy="481084"/>
-                    </a:xfrm>
-                    <a:prstGeom prst="rect"/>
-                  </pic:spPr>
-                </pic:pic>
-              </a:graphicData>
-            </a:graphic>
-          </wp:inline>
-        </w:drawing>
-      </w:r>
-    </w:p>
-    <w:p>
-      <w:pPr/>
-    </w:p>
-    <w:p>
-      <w:pPr/>
-      <w:r>
-        <w:rPr>
-          <w:b w:val="0"/>
-          <w:sz w:val="22"/>
-        </w:rPr>
-        <w:t>Schreibe direkt darunter diesen Code – er startet den Zeit-Stopp wenn du T drückst:</w:t>
-      </w:r>
-    </w:p>
-    <w:p>
-      <w:pPr/>
-    </w:p>
-    <w:p>
-      <w:pPr/>
-      <w:r>
-        <w:drawing>
-          <wp:inline xmlns:a="http://schemas.openxmlformats.org/drawingml/2006/main" xmlns:pic="http://schemas.openxmlformats.org/drawingml/2006/picture">
-            <wp:extent cx="5669280" cy="1252993"/>
-            <wp:docPr id="2048877119" name="Picture 2048877119"/>
-            <wp:cNvGraphicFramePr>
-              <a:graphicFrameLocks noChangeAspect="1"/>
-            </wp:cNvGraphicFramePr>
-            <a:graphic>
-              <a:graphicData uri="http://schemas.openxmlformats.org/drawingml/2006/picture">
-                <pic:pic>
-                  <pic:nvPicPr>
-                    <pic:cNvPr id="0" name="ts5_activate.png"/>
-                    <pic:cNvPicPr/>
-                  </pic:nvPicPr>
-                  <pic:blipFill>
-                    <a:blip r:embed="rId42"/>
-                    <a:stretch>
-                      <a:fillRect/>
-                    </a:stretch>
-                  </pic:blipFill>
-                  <pic:spPr>
-                    <a:xfrm>
-                      <a:off x="0" y="0"/>
-                      <a:ext cx="5669280" cy="1252993"/>
-                    </a:xfrm>
-                    <a:prstGeom prst="rect"/>
-                  </pic:spPr>
-                </pic:pic>
-              </a:graphicData>
-            </a:graphic>
-          </wp:inline>
-        </w:drawing>
-      </w:r>
-    </w:p>
-    <w:p>
-      <w:pPr/>
-    </w:p>
-    <w:p>
-      <w:pPr/>
-      <w:r>
+        </w:rPr>
+      </w:pPr>
+    </w:p>
+    <w:p>
+      <w:pPr>
         <w:rPr>
           <w:b/>
-          <w:sz w:val="22"/>
-        </w:rPr>
+        </w:rPr>
+      </w:pPr>
+    </w:p>
+    <w:p>
+      <w:r>
+        <w:rPr>
+          <w:b/>
+        </w:rPr>
+        <w:lastRenderedPageBreak/>
         <w:t>Testen:</w:t>
       </w:r>
     </w:p>
     <w:p>
-      <w:pPr/>
-      <w:r>
-        <w:rPr>
-          <w:b w:val="0"/>
-          <w:sz w:val="22"/>
-        </w:rPr>
+      <w:r>
         <w:t>Starte das Spiel und drücke T. Hören die Gegner auf, sich zu bewegen? Kannst du dich selbst noch bewegen?</w:t>
       </w:r>
     </w:p>
-    <w:p>
-      <w:pPr/>
-    </w:p>
-    <w:p>
-      <w:pPr/>
-      <w:r>
-        <w:rPr>
-          <w:b w:val="0"/>
-          <w:sz w:val="22"/>
-        </w:rPr>
+    <w:p/>
+    <w:p>
+      <w:r>
         <w:t>Tipp: Du kannst die Dauer anpassen, indem du den Wert 3000 in TIME_STOP_DURATION änderst (z. B. 5000 = 5 Sekunden).</w:t>
       </w:r>
     </w:p>

</xml_diff>